<commit_message>
docs: remove bateria e display OLED, atualiza diagrama de blocos
- diagrama de blocos com alimentacao da luva pela USB do PC e o
  modulo de monitoramento (Raspberry Pi + Ubidots); sem bateria e sem OLED
- receptor: codigo do display OLED removido e .bin recompilado
- README: componentes e pinagem sem bateria e sem OLED
- URD v3.1.0: textos, tabelas e requisitos UR-05/06/10 atualizados,
  diagrama de blocos incluido como figura

Co-Authored-By: Claude Opus 5.5 <noreply@anthropic.com>
Claude-Session: https://claude.ai/code/session_01V2Fn3wbky1fLCtPYSUmk3G
</commit_message>
<xml_diff>
--- a/docs/GloveBot_URD.docx
+++ b/docs/GloveBot_URD.docx
@@ -146,7 +146,7 @@
               <w:rPr>
                 <w:color w:val="000000"/>
               </w:rPr>
-              <w:t>V.3.0.0</w:t>
+              <w:t>V.3.1.0</w:t>
             </w:r>
           </w:p>
         </w:tc>
@@ -453,7 +453,7 @@
         <w:rPr>
           <w:color w:val="000000"/>
         </w:rPr>
-        <w:t xml:space="preserve">O módulo emissor, baseado na placa LilyPad IOT ATMega32U4, utiliza o acelerômetro MPU-6050 para capturar o giro lateral (roll) do pulso do usuário, transmitindo esses dados sem fio via Bluetooth (HC-08 em modo Master) ao módulo receptor. O receptor, controlado pelo mbed LPC1768 (Cortex-M3), interpreta os dados recebidos via HC-08 em modo Slave e aciona o servo motor MG995 para abrir ou fechar a garra metálica de forma proporcional ao gesto detectado. O status da operação, incluindo o ângulo atual e a situação da garra (FECHADO, MEIO ou ABERTO), é exibido em tempo real em um display OLED 128x32 via I2C.</w:t>
+        <w:t xml:space="preserve">O módulo emissor, baseado na placa LilyPad IOT ATMega32U4, utiliza o acelerômetro MPU-6050 para capturar o giro lateral (roll) do pulso do usuário, transmitindo esses dados sem fio via Bluetooth (HC-08 em modo Master) ao módulo receptor. O receptor, controlado pelo mbed LPC1768 (Cortex-M3), interpreta os dados recebidos via HC-08 em modo Slave e aciona o servo motor MG995 para abrir ou fechar a garra metálica de forma proporcional ao gesto detectado. O ângulo atual e a situação da garra (fechada, meio ou aberta) são acompanhados em tempo real em um dashboard online, descrito na seção 6. A luva é alimentada pela porta USB do computador.</w:t>
       </w:r>
     </w:p>
     <w:p>
@@ -690,7 +690,7 @@
                 <w:sz w:val="20"/>
                 <w:szCs w:val="20"/>
               </w:rPr>
-              <w:t xml:space="preserve">Bateria Li-Ion Wearable</w:t>
+              <w:t xml:space="preserve">Alimentação USB (PC)</w:t>
             </w:r>
           </w:p>
         </w:tc>
@@ -946,7 +946,7 @@
                 <w:sz w:val="20"/>
                 <w:szCs w:val="20"/>
               </w:rPr>
-              <w:t>Display OLED 128x32</w:t>
+              <w:t>LED de status (LED1)</w:t>
             </w:r>
           </w:p>
         </w:tc>
@@ -1273,6 +1273,61 @@
     </w:p>
     <w:p>
       <w:pPr>
+        <w:keepNext/>
+        <w:spacing w:before="160" w:after="80"/>
+        <w:jc w:val="center"/>
+      </w:pPr>
+      <w:r>
+        <w:drawing>
+          <wp:inline distT="0" distB="0" distL="0" distR="0">
+            <wp:extent cx="3900000" cy="5391750"/>
+            <wp:docPr id="1002" name="Diagrama"/>
+            <wp:cNvGraphicFramePr>
+              <a:graphicFrameLocks xmlns:a="http://schemas.openxmlformats.org/drawingml/2006/main" noChangeAspect="1"/>
+            </wp:cNvGraphicFramePr>
+            <a:graphic xmlns:a="http://schemas.openxmlformats.org/drawingml/2006/main">
+              <a:graphicData uri="http://schemas.openxmlformats.org/drawingml/2006/picture">
+                <pic:pic xmlns:pic="http://schemas.openxmlformats.org/drawingml/2006/picture">
+                  <pic:nvPicPr>
+                    <pic:cNvPr id="1002" name="diagrama_blocos.png"/>
+                    <pic:cNvPicPr/>
+                  </pic:nvPicPr>
+                  <pic:blipFill>
+                    <a:blip r:embed="rIdDiag"/>
+                    <a:stretch>
+                      <a:fillRect/>
+                    </a:stretch>
+                  </pic:blipFill>
+                  <pic:spPr>
+                    <a:xfrm>
+                      <a:off x="0" y="0"/>
+                      <a:ext cx="3900000" cy="5391750"/>
+                    </a:xfrm>
+                    <a:prstGeom prst="rect">
+                      <a:avLst/>
+                    </a:prstGeom>
+                  </pic:spPr>
+                </pic:pic>
+              </a:graphicData>
+            </a:graphic>
+          </wp:inline>
+        </w:drawing>
+      </w:r>
+    </w:p>
+    <w:p>
+      <w:pPr>
+        <w:spacing w:after="160"/>
+        <w:jc w:val="center"/>
+      </w:pPr>
+      <w:r>
+        <w:rPr>
+          <w:color w:val="000000"/>
+        </w:rPr>
+        <w:t xml:space="preserve">Figura 1 — Diagrama de blocos do GloveBot.</w:t>
+      </w:r>
+    </w:p>
+    <w:p>
+      <w:pPr>
         <w:spacing w:after="120"/>
       </w:pPr>
     </w:p>
@@ -1736,7 +1791,7 @@
               <w:rPr>
                 <w:color w:val="000000"/>
               </w:rPr>
-              <w:t xml:space="preserve">Bateria Li-Ion Wearable</w:t>
+              <w:t xml:space="preserve">Cabo USB (PC)</w:t>
             </w:r>
           </w:p>
         </w:tc>
@@ -1763,7 +1818,7 @@
               <w:rPr>
                 <w:color w:val="000000"/>
               </w:rPr>
-              <w:t>Alimentação independente sem cabos</w:t>
+              <w:t>Alimentação da luva e gravação do código</w:t>
             </w:r>
           </w:p>
         </w:tc>
@@ -2037,97 +2092,6 @@
                 <w:color w:val="000000"/>
               </w:rPr>
               <w:t>Atuação mecânica (abertura/fechamento da garra)</w:t>
-            </w:r>
-          </w:p>
-        </w:tc>
-      </w:tr>
-      <w:tr>
-        <w:tblPrEx>
-          <w:tblCellMar>
-            <w:top w:w="0" w:type="dxa"/>
-            <w:bottom w:w="0" w:type="dxa"/>
-          </w:tblCellMar>
-        </w:tblPrEx>
-        <w:tc>
-          <w:tcPr>
-            <w:tcW w:w="2200" w:type="dxa"/>
-            <w:tcBorders>
-              <w:top w:val="single" w:sz="1" w:space="0" w:color="CCCCCC"/>
-              <w:left w:val="single" w:sz="1" w:space="0" w:color="CCCCCC"/>
-              <w:bottom w:val="single" w:sz="1" w:space="0" w:color="CCCCCC"/>
-              <w:right w:val="single" w:sz="1" w:space="0" w:color="CCCCCC"/>
-            </w:tcBorders>
-            <w:shd w:val="clear" w:color="auto" w:fill="D6E4F0"/>
-            <w:tcMar>
-              <w:top w:w="80" w:type="dxa"/>
-              <w:left w:w="140" w:type="dxa"/>
-              <w:bottom w:w="80" w:type="dxa"/>
-              <w:right w:w="140" w:type="dxa"/>
-            </w:tcMar>
-            <w:vAlign w:val="center"/>
-          </w:tcPr>
-          <w:p>
-            <w:r>
-              <w:rPr>
-                <w:b/>
-                <w:bCs/>
-                <w:color w:val="000000"/>
-              </w:rPr>
-              <w:t>Garra (Receptor)</w:t>
-            </w:r>
-          </w:p>
-        </w:tc>
-        <w:tc>
-          <w:tcPr>
-            <w:tcW w:w="3300" w:type="dxa"/>
-            <w:tcBorders>
-              <w:top w:val="single" w:sz="1" w:space="0" w:color="CCCCCC"/>
-              <w:left w:val="single" w:sz="1" w:space="0" w:color="CCCCCC"/>
-              <w:bottom w:val="single" w:sz="1" w:space="0" w:color="CCCCCC"/>
-              <w:right w:val="single" w:sz="1" w:space="0" w:color="CCCCCC"/>
-            </w:tcBorders>
-            <w:shd w:val="clear" w:color="auto" w:fill="FFFFFF"/>
-            <w:tcMar>
-              <w:top w:w="80" w:type="dxa"/>
-              <w:left w:w="140" w:type="dxa"/>
-              <w:bottom w:w="80" w:type="dxa"/>
-              <w:right w:w="140" w:type="dxa"/>
-            </w:tcMar>
-            <w:vAlign w:val="center"/>
-          </w:tcPr>
-          <w:p>
-            <w:r>
-              <w:rPr>
-                <w:color w:val="000000"/>
-              </w:rPr>
-              <w:t>Display OLED 128x32 I2C</w:t>
-            </w:r>
-          </w:p>
-        </w:tc>
-        <w:tc>
-          <w:tcPr>
-            <w:tcW w:w="3500" w:type="dxa"/>
-            <w:tcBorders>
-              <w:top w:val="single" w:sz="1" w:space="0" w:color="CCCCCC"/>
-              <w:left w:val="single" w:sz="1" w:space="0" w:color="CCCCCC"/>
-              <w:bottom w:val="single" w:sz="1" w:space="0" w:color="CCCCCC"/>
-              <w:right w:val="single" w:sz="1" w:space="0" w:color="CCCCCC"/>
-            </w:tcBorders>
-            <w:shd w:val="clear" w:color="auto" w:fill="FFFFFF"/>
-            <w:tcMar>
-              <w:top w:w="80" w:type="dxa"/>
-              <w:left w:w="140" w:type="dxa"/>
-              <w:bottom w:w="80" w:type="dxa"/>
-              <w:right w:w="140" w:type="dxa"/>
-            </w:tcMar>
-            <w:vAlign w:val="center"/>
-          </w:tcPr>
-          <w:p>
-            <w:r>
-              <w:rPr>
-                <w:color w:val="000000"/>
-              </w:rPr>
-              <w:t>Exibição de status, ângulo e situação operacional</w:t>
             </w:r>
           </w:p>
         </w:tc>
@@ -3526,7 +3490,7 @@
               <w:rPr>
                 <w:color w:val="000000"/>
               </w:rPr>
-              <w:t xml:space="preserve">O módulo emissor (luva) deve operar sem cabos, alimentado por bateria wearable</w:t>
+              <w:t xml:space="preserve">O módulo emissor (luva) deve ser alimentado pela porta USB do computador, sem fonte adicional</w:t>
             </w:r>
           </w:p>
         </w:tc>
@@ -3623,7 +3587,7 @@
               <w:rPr>
                 <w:color w:val="000000"/>
               </w:rPr>
-              <w:t>O módulo receptor (garra) deve exibir o status da conexão e o ângulo de abertura em display OLED</w:t>
+              <w:t>O módulo receptor (garra) deve indicar visualmente o recebimento de cada comando (LED da placa mbed)</w:t>
             </w:r>
           </w:p>
         </w:tc>
@@ -4011,7 +3975,7 @@
               <w:rPr>
                 <w:color w:val="000000"/>
               </w:rPr>
-              <w:t>Exibir status textual da garra no display (ABERTO / MEIO / FECHADO)</w:t>
+              <w:t>Exibir no dashboard o status textual da garra (aberta / meio / fechada)</w:t>
             </w:r>
           </w:p>
         </w:tc>
@@ -5484,7 +5448,7 @@
         <w:rPr>
           <w:color w:val="000000"/>
         </w:rPr>
-        <w:t xml:space="preserve">Figura 1 — Dashboard do GloveBot no Ubidots.</w:t>
+        <w:t xml:space="preserve">Figura 2 — Dashboard do GloveBot no Ubidots.</w:t>
       </w:r>
     </w:p>
     <w:p>

</xml_diff>